<commit_message>
Add observed screenshots to manual samples
</commit_message>
<xml_diff>
--- a/tests/manual_samples/changedetection/output/manual.docx
+++ b/tests/manual_samples/changedetection/output/manual.docx
@@ -224,7 +224,7 @@
         <w:t xml:space="preserve">説明: </w:t>
       </w:r>
       <w:r>
-        <w:t>固定バージョンの公開ソースをもとに作成しており、対象アプリでの操作・検証は行っていません。</w:t>
+        <w:t>公開サイトで監視 URL の入力欄は確認できましたが、送信は有料サブスクリプションへ進むため停止しました。セルフホスト版の UI はこの実行環境で起動できず、監視の作成・保存結果は未検証です。</w:t>
       </w:r>
     </w:p>
     <w:p>
@@ -267,6 +267,70 @@
       </w:r>
       <w:r>
         <w:t>ソース上、この入口または選択肢から操作できる想定です。</w:t>
+      </w:r>
+    </w:p>
+    <w:p>
+      <w:pPr>
+        <w:spacing w:after="0"/>
+      </w:pPr>
+      <w:r>
+        <w:rPr>
+          <w:b/>
+        </w:rPr>
+        <w:t xml:space="preserve">実際の結果: </w:t>
+      </w:r>
+      <w:r>
+        <w:t>公式公開サイトのトップに監視 URL 入力欄と月額サブスクリプションの案内が表示されました。監視登録は実行していません。</w:t>
+      </w:r>
+    </w:p>
+    <w:p>
+      <w:pPr>
+        <w:keepNext/>
+        <w:jc w:val="center"/>
+      </w:pPr>
+      <w:r>
+        <w:drawing>
+          <wp:inline xmlns:a="http://schemas.openxmlformats.org/drawingml/2006/main" xmlns:pic="http://schemas.openxmlformats.org/drawingml/2006/picture">
+            <wp:extent cx="5715000" cy="3925883"/>
+            <wp:docPr id="1" name="Picture 1" descr="https://changedetection.io/ | ev-changedetection-public-homepage"/>
+            <wp:cNvGraphicFramePr>
+              <a:graphicFrameLocks noChangeAspect="1"/>
+            </wp:cNvGraphicFramePr>
+            <a:graphic>
+              <a:graphicData uri="http://schemas.openxmlformats.org/drawingml/2006/picture">
+                <pic:pic>
+                  <pic:nvPicPr>
+                    <pic:cNvPr id="0" name="ev-changedetection-public-homepage.jpg"/>
+                    <pic:cNvPicPr/>
+                  </pic:nvPicPr>
+                  <pic:blipFill>
+                    <a:blip r:embed="rId10"/>
+                    <a:stretch>
+                      <a:fillRect/>
+                    </a:stretch>
+                  </pic:blipFill>
+                  <pic:spPr>
+                    <a:xfrm>
+                      <a:off x="0" y="0"/>
+                      <a:ext cx="5715000" cy="3925883"/>
+                    </a:xfrm>
+                    <a:prstGeom prst="rect"/>
+                  </pic:spPr>
+                </pic:pic>
+              </a:graphicData>
+            </a:graphic>
+          </wp:inline>
+        </w:drawing>
+      </w:r>
+    </w:p>
+    <w:p>
+      <w:pPr>
+        <w:keepLines/>
+        <w:spacing w:after="200"/>
+        <w:jc w:val="center"/>
+      </w:pPr>
+      <w:r>
+        <w:t>図 1  https://changedetection.io/</w:t>
       </w:r>
     </w:p>
     <w:p>
@@ -1050,7 +1114,7 @@
         <w:pStyle w:val="ListBullet"/>
       </w:pPr>
       <w:r>
-        <w:t>このガイドは固定コミットの公開ソースに基づいています。稼働中のアプリ画面で手順を実行しておらず、スクリーンショット証拠はありません。メニュー位置、項目の表示、実行結果は対象環境で確認してください。</w:t>
+        <w:t>固定コミットのソースに基づいて作成した手順です。公式公開サイトで確認できたのは監視 URL 欄と有料サブスクリプション案内のみです。セルフホスト版を起動できず、監視の作成、内容選択、Browser Steps の実行結果は未検証です。</w:t>
       </w:r>
     </w:p>
     <w:sectPr>

</xml_diff>